<commit_message>
Separate notebook and helper tools
</commit_message>
<xml_diff>
--- a/submission/assignment1_report_draft.docx
+++ b/submission/assignment1_report_draft.docx
@@ -2856,7 +2856,7 @@
           <w:rFonts w:ascii="Consolas" w:hAnsi="Consolas" w:eastAsia="Consolas"/>
           <w:sz w:val="19"/>
         </w:rPr>
-        <w:t>pairs_trading_colab.ipynb</w:t>
+        <w:t>notebook/pairs_trading_colab.ipynb</w:t>
       </w:r>
     </w:p>
     <w:p>
@@ -2874,7 +2874,7 @@
           <w:rFonts w:ascii="Consolas" w:hAnsi="Consolas" w:eastAsia="Consolas"/>
           <w:sz w:val="19"/>
         </w:rPr>
-        <w:t>pairs_trading_colab.py</w:t>
+        <w:t>notebook/pairs_trading_colab.py</w:t>
       </w:r>
     </w:p>
     <w:p>

</xml_diff>

<commit_message>
Rename notebook files for report clarity
</commit_message>
<xml_diff>
--- a/submission/assignment1_report_draft.docx
+++ b/submission/assignment1_report_draft.docx
@@ -2843,7 +2843,7 @@
     </w:p>
     <w:p>
       <w:r>
-        <w:t>The working Colab-ready notebook is provided in:</w:t>
+        <w:t>The working assignment notebook is provided in:</w:t>
       </w:r>
     </w:p>
     <w:p>
@@ -2856,7 +2856,7 @@
           <w:rFonts w:ascii="Consolas" w:hAnsi="Consolas" w:eastAsia="Consolas"/>
           <w:sz w:val="19"/>
         </w:rPr>
-        <w:t>notebook/pairs_trading_colab.ipynb</w:t>
+        <w:t>notebook/assignment1_pairs_trading_report.ipynb</w:t>
       </w:r>
     </w:p>
     <w:p>
@@ -2874,7 +2874,7 @@
           <w:rFonts w:ascii="Consolas" w:hAnsi="Consolas" w:eastAsia="Consolas"/>
           <w:sz w:val="19"/>
         </w:rPr>
-        <w:t>notebook/pairs_trading_colab.py</w:t>
+        <w:t>notebook/assignment1_pairs_trading_report.py</w:t>
       </w:r>
     </w:p>
     <w:p>

</xml_diff>

<commit_message>
Rename notebook folder to analysis
</commit_message>
<xml_diff>
--- a/submission/assignment1_report_draft.docx
+++ b/submission/assignment1_report_draft.docx
@@ -2856,7 +2856,7 @@
           <w:rFonts w:ascii="Consolas" w:hAnsi="Consolas" w:eastAsia="Consolas"/>
           <w:sz w:val="19"/>
         </w:rPr>
-        <w:t>notebook/assignment1_pairs_trading_report.ipynb</w:t>
+        <w:t>analysis/assignment1_pairs_trading_report.ipynb</w:t>
       </w:r>
     </w:p>
     <w:p>
@@ -2874,7 +2874,7 @@
           <w:rFonts w:ascii="Consolas" w:hAnsi="Consolas" w:eastAsia="Consolas"/>
           <w:sz w:val="19"/>
         </w:rPr>
-        <w:t>notebook/assignment1_pairs_trading_report.py</w:t>
+        <w:t>analysis/assignment1_pairs_trading_report.py</w:t>
       </w:r>
     </w:p>
     <w:p>

</xml_diff>